<commit_message>
Prepare reviewed AI-FMS public release
</commit_message>
<xml_diff>
--- a/output/publication/ai-fms-multichannel-release-2026-08-25/01-zenodo-preprint/AI-FMS_System_Development_Phase_I_Evaluation_Preprint.docx
+++ b/output/publication/ai-fms-multichannel-release-2026-08-25/01-zenodo-preprint/AI-FMS_System_Development_Phase_I_Evaluation_Preprint.docx
@@ -59,25 +59,8 @@
           <w:b/>
           <w:color w:val="24343B"/>
           <w:sz w:val="24"/>
-          <w:highlight w:val="yellow"/>
         </w:rPr>
-        <w:t>Haoran Zhu • [CONFIRM ADDITIONAL AUTHOR(S)]</w:t>
-      </w:r>
-    </w:p>
-    <w:p>
-      <w:pPr>
-        <w:spacing w:after="140"/>
-        <w:jc w:val="center"/>
-      </w:pPr>
-      <w:r>
-        <w:rPr>
-          <w:rFonts w:ascii="Arial" w:hAnsi="Arial"/>
-          <w:b w:val="0"/>
-          <w:color w:val="5F7279"/>
-          <w:sz w:val="20"/>
-          <w:highlight w:val="yellow"/>
-        </w:rPr>
-        <w:t>[CONFIRM AFFILIATION AND CORRESPONDING EMAIL]</w:t>
+        <w:t>Haoran ZHU</w:t>
       </w:r>
     </w:p>
     <w:p>
@@ -92,7 +75,37 @@
           <w:color w:val="5F7279"/>
           <w:sz w:val="20"/>
         </w:rPr>
-        <w:t>Version 1.0 draft • 25 August 2026</w:t>
+        <w:t>Kang Chiao International School East China Campus</w:t>
+      </w:r>
+    </w:p>
+    <w:p>
+      <w:pPr>
+        <w:spacing w:after="140"/>
+        <w:jc w:val="center"/>
+      </w:pPr>
+      <w:r>
+        <w:rPr>
+          <w:rFonts w:ascii="Arial" w:hAnsi="Arial"/>
+          <w:b w:val="0"/>
+          <w:color w:val="5F7279"/>
+          <w:sz w:val="20"/>
+        </w:rPr>
+        <w:t>13061747546@163.com</w:t>
+      </w:r>
+    </w:p>
+    <w:p>
+      <w:pPr>
+        <w:spacing w:after="140"/>
+        <w:jc w:val="center"/>
+      </w:pPr>
+      <w:r>
+        <w:rPr>
+          <w:rFonts w:ascii="Arial" w:hAnsi="Arial"/>
+          <w:b w:val="0"/>
+          <w:color w:val="5F7279"/>
+          <w:sz w:val="20"/>
+        </w:rPr>
+        <w:t>Version 1.0 draft, revised 3 October 2026</w:t>
       </w:r>
     </w:p>
     <w:p>
@@ -150,7 +163,7 @@
           <w:rFonts w:ascii="Arial" w:hAnsi="Arial"/>
           <w:sz w:val="21"/>
         </w:rPr>
-        <w:t>Functional Movement Screen (FMS) assessment depends on trained human observation, yet practical video review can be constrained by transient viewing, remote access, repeated manual navigation, qualitative judgments, and the compression of movement into an ordinal 0-3 score. We developed AI-FMS, a human-in-the-loop video-review system that supports all seven FMS movements through upload, repetition segmentation, looped playback, reviewer scoring, structured protocol fields, pose overlays, quantitative features, explainable first-pass score suggestions, quality warnings, abstention, adjudication, and traceable export. The system uses two-dimensional pose landmarks to preserve movement evidence such as joint angles, relative distances, side-specific trajectories, and full-cycle events while retaining human authority over protocol, pain, clearing conditions, and final scores.</w:t>
+        <w:t>Functional Movement Screen (FMS) assessment depends on trained human observation, yet practical video review can be constrained by transient viewing, remote access, repeated manual navigation, qualitative judgments, and the compression of movement into an ordinal 0-3 score. We developed AI-FMS, a human-in-the-loop video-review system with implemented functionality for all seven FMS movements, including upload, repetition segmentation, looped playback, reviewer scoring, structured protocol fields, pose overlays, quantitative features, explainable first-pass score suggestions, quality warnings, abstention, adjudication, and traceable export. The system uses two-dimensional pose landmarks to preserve movement evidence such as joint angles, relative distances, side-specific trajectories, and full-cycle events while retaining human authority over protocol, pain, clearing conditions, and final scores.</w:t>
       </w:r>
     </w:p>
     <w:p>
@@ -159,7 +172,16 @@
           <w:rFonts w:ascii="Arial" w:hAnsi="Arial"/>
           <w:sz w:val="21"/>
         </w:rPr>
-        <w:t>Phase I evaluated the workflow on four movements: Deep Squat, Hurdle Step, Active Straight-Leg Raise, and Rotary Stability. The curated corpus contained 28 unique source videos, 29 ingestion records, and 110 canonical repetitions. A deterministic balanced subset of 32 repetitions, eight per movement and drawn from 21 source videos, was reviewed by two reviewers in two mutually blinded rounds. Round B remained blind to AI scores and pose evidence. Reviewers agreed on numeric scores for all 26 mutually numeric items in both rounds and agreed on final status for all 32 items in Round B. A final locked AI pass produced output for 28 items and abstained on four staged-protocol Deep Squat items. Among 25 human-score-comparable items, exact AI-human agreement was 16/25, within-one agreement was 23/25, mean absolute error was 0.44, and linear weighted kappa was 0.4917. Secondary analyses illustrate how continuous pose evidence can distinguish movement strategies that share an ordinal score. These findings support feasibility and interface value, not clinical validity or injury prediction. AI-FMS demonstrates a practical model of human-AI collaboration in which automation organizes evidence and offers inspectable suggestions while qualified reviewers retain responsibility for interpretation.</w:t>
+        <w:t>Building on the seven-movement system, Phase I quantitative research focused on Deep Squat, Hurdle Step, Active Straight-Leg Raise, and Rotary Stability. The corpus contained 28 unique source videos and 110 canonical repetitions. A balanced subset of 32 repetitions, eight per movement, was reviewed by two reviewers in two independent blinded rounds. Both rounds concealed AI scores, pose evidence, previous ratings, and the other reviewer's results. Human rating consistency and AI-human score comparison formed one part of the study: among 25 comparable items, the locked AI matched the human reference exactly on 16 and was within one point on 23. These are internal exploratory findings, not independent external validation.</w:t>
+      </w:r>
+    </w:p>
+    <w:p>
+      <w:r>
+        <w:rPr>
+          <w:rFonts w:ascii="Arial" w:hAnsi="Arial"/>
+          <w:sz w:val="21"/>
+        </w:rPr>
+        <w:t>The structured movement evidence also enabled further analyses: a Deep Squat depth-and-joint-strategy continuum, ASLR bilateral repeatability, different control and deduction pathways within the same Hurdle Step score, and Rotary Stability full-cycle event structures. These analyses preserve continuous differences, bilateral relationships, and temporal information beyond the 0-3 score, providing traceable evidence for movement explanation, cross-repetition comparison, and future research. AI-FMS thus combines seven-movement system development, Phase I quantitative research, and movement analyses enabled by the system's data. Automation organizes evidence and offers inspectable suggestions while human reviewers retain final interpretation and scoring authority. The system is not intended for clinical diagnosis or injury prediction.</w:t>
       </w:r>
     </w:p>
     <w:p>
@@ -236,7 +258,7 @@
           <w:rFonts w:ascii="Arial" w:hAnsi="Arial"/>
           <w:sz w:val="21"/>
         </w:rPr>
-        <w:t>This report makes four contributions:</w:t>
+        <w:t>This report makes three contributions:</w:t>
       </w:r>
     </w:p>
     <w:p>
@@ -252,7 +274,7 @@
           <w:rFonts w:ascii="Arial" w:hAnsi="Arial"/>
           <w:sz w:val="21"/>
         </w:rPr>
-        <w:t>It describes an end-to-end AI-assisted review platform spanning all seven FMS movements.</w:t>
+        <w:t>It implements an end-to-end AI-assisted review system for all seven FMS movements, integrating video annotation, pose evidence, explainable suggestions, human review, and traceable export.</w:t>
       </w:r>
     </w:p>
     <w:p>
@@ -268,7 +290,7 @@
           <w:rFonts w:ascii="Arial" w:hAnsi="Arial"/>
           <w:sz w:val="21"/>
         </w:rPr>
-        <w:t>It documents a reproducible Phase I corpus and blinded two-reviewer workflow for four movements.</w:t>
+        <w:t>It conducts Phase I quantitative research on four movements, establishing a reproducible corpus and a two-reviewer, two-round blinded workflow, and reporting human rating consistency, an internal AI-human benchmark, coverage, and abstention.</w:t>
       </w:r>
     </w:p>
     <w:p>
@@ -284,23 +306,7 @@
           <w:rFonts w:ascii="Arial" w:hAnsi="Arial"/>
           <w:sz w:val="21"/>
         </w:rPr>
-        <w:t>It reports an internal locked AI-human benchmark with coverage and abstention, rather than forcing a score for every item.</w:t>
-      </w:r>
-    </w:p>
-    <w:p>
-      <w:pPr>
-        <w:spacing w:after="80" w:line="283" w:lineRule="auto"/>
-        <w:numPr>
-          <w:ilvl w:val="0"/>
-          <w:numId w:val="14"/>
-        </w:numPr>
-      </w:pPr>
-      <w:r>
-        <w:rPr>
-          <w:rFonts w:ascii="Arial" w:hAnsi="Arial"/>
-          <w:sz w:val="21"/>
-        </w:rPr>
-        <w:t>It shows how continuous pose-derived features can reveal movement-strategy differences within the same ordinal score while preserving non-clinical claim boundaries.</w:t>
+        <w:t>It uses structured movement evidence to analyze movement-specific strategy continua, bilateral repeatability, control and deduction pathways, and full-cycle events, demonstrating information beyond the ordinal score while preserving non-clinical claim boundaries.</w:t>
       </w:r>
     </w:p>
     <w:p>
@@ -445,7 +451,7 @@
         <w:spacing w:after="80" w:line="283" w:lineRule="auto"/>
         <w:numPr>
           <w:ilvl w:val="0"/>
-          <w:numId w:val="15"/>
+          <w:numId w:val="14"/>
         </w:numPr>
       </w:pPr>
       <w:r>
@@ -461,7 +467,7 @@
         <w:spacing w:after="80" w:line="283" w:lineRule="auto"/>
         <w:numPr>
           <w:ilvl w:val="0"/>
-          <w:numId w:val="16"/>
+          <w:numId w:val="15"/>
         </w:numPr>
       </w:pPr>
       <w:r>
@@ -477,7 +483,7 @@
         <w:spacing w:after="80" w:line="283" w:lineRule="auto"/>
         <w:numPr>
           <w:ilvl w:val="0"/>
-          <w:numId w:val="17"/>
+          <w:numId w:val="16"/>
         </w:numPr>
       </w:pPr>
       <w:r>
@@ -493,7 +499,7 @@
         <w:spacing w:after="80" w:line="283" w:lineRule="auto"/>
         <w:numPr>
           <w:ilvl w:val="0"/>
-          <w:numId w:val="18"/>
+          <w:numId w:val="17"/>
         </w:numPr>
       </w:pPr>
       <w:r>
@@ -509,7 +515,7 @@
         <w:spacing w:after="80" w:line="283" w:lineRule="auto"/>
         <w:numPr>
           <w:ilvl w:val="0"/>
-          <w:numId w:val="19"/>
+          <w:numId w:val="18"/>
         </w:numPr>
       </w:pPr>
       <w:r>
@@ -525,7 +531,7 @@
         <w:spacing w:after="80" w:line="283" w:lineRule="auto"/>
         <w:numPr>
           <w:ilvl w:val="0"/>
-          <w:numId w:val="20"/>
+          <w:numId w:val="19"/>
         </w:numPr>
       </w:pPr>
       <w:r>
@@ -541,7 +547,7 @@
         <w:spacing w:after="80" w:line="283" w:lineRule="auto"/>
         <w:numPr>
           <w:ilvl w:val="0"/>
-          <w:numId w:val="21"/>
+          <w:numId w:val="20"/>
         </w:numPr>
       </w:pPr>
       <w:r>
@@ -557,7 +563,7 @@
         <w:spacing w:after="80" w:line="283" w:lineRule="auto"/>
         <w:numPr>
           <w:ilvl w:val="0"/>
-          <w:numId w:val="22"/>
+          <w:numId w:val="21"/>
         </w:numPr>
       </w:pPr>
       <w:r>
@@ -634,6 +640,7 @@
     </w:p>
     <w:p>
       <w:pPr>
+        <w:keepNext/>
         <w:spacing w:before="120" w:after="60"/>
         <w:jc w:val="center"/>
       </w:pPr>
@@ -687,6 +694,7 @@
     </w:p>
     <w:p>
       <w:pPr>
+        <w:keepNext/>
         <w:spacing w:before="120" w:after="60"/>
         <w:jc w:val="center"/>
       </w:pPr>
@@ -740,6 +748,7 @@
     </w:p>
     <w:p>
       <w:pPr>
+        <w:keepNext/>
         <w:spacing w:before="120" w:after="60"/>
         <w:jc w:val="center"/>
       </w:pPr>
@@ -877,6 +886,15 @@
           <w:rFonts w:ascii="Arial" w:hAnsi="Arial"/>
           <w:sz w:val="21"/>
         </w:rPr>
+        <w:t>One reviewer, Haoran ZHU, completed FMS Level 1 certification on 17 July 2025 and FMS Level 2 certification on 10 August 2025, before the Phase I reviews. These certifications informed his use of the FMS protocol and interpretation of movement evidence.</w:t>
+      </w:r>
+    </w:p>
+    <w:p>
+      <w:r>
+        <w:rPr>
+          <w:rFonts w:ascii="Arial" w:hAnsi="Arial"/>
+          <w:sz w:val="21"/>
+        </w:rPr>
         <w:t>Two reviewers completed Round A and Round B approximately 51 hours apart. In both rounds, each reviewer was blind to source filenames, historical labels, AI scores, pose evidence, audio, prior answers, and the other reviewer's responses. The order was independently randomized. Reviewers recorded:</w:t>
       </w:r>
     </w:p>
@@ -1080,7 +1098,7 @@
           <w:rFonts w:ascii="Arial" w:hAnsi="Arial"/>
           <w:sz w:val="21"/>
         </w:rPr>
-        <w:t>Between rounds, each reviewer changed one numeric score, and both changes concerned the same Hurdle Step repetition. The result suggests strong agreement within this small trained pair, but it should not be generalized to other reviewers without a larger multi-rater study. Exact agreement can also be inflated when a sample contains a limited score range.</w:t>
+        <w:t>Between rounds, each reviewer changed one numeric score, and both changes concerned the same Hurdle Step repetition. The result suggests strong agreement within this small reviewer pair, but it should not be generalized to other reviewers without a larger multi-rater study. Exact agreement can also be inflated when a sample contains a limited score range.</w:t>
       </w:r>
     </w:p>
     <w:p>
@@ -1545,7 +1563,7 @@
                 <w:rFonts w:ascii="Arial" w:hAnsi="Arial"/>
                 <w:sz w:val="17"/>
               </w:rPr>
-              <w:t>Agreement within this trained reviewer pair</w:t>
+              <w:t>Agreement within this reviewer pair</w:t>
             </w:r>
           </w:p>
         </w:tc>
@@ -1904,6 +1922,7 @@
     </w:p>
     <w:p>
       <w:pPr>
+        <w:keepNext/>
         <w:spacing w:before="120" w:after="60"/>
         <w:jc w:val="center"/>
       </w:pPr>
@@ -1980,6 +1999,7 @@
     </w:p>
     <w:p>
       <w:pPr>
+        <w:keepNext/>
         <w:spacing w:before="120" w:after="60"/>
         <w:jc w:val="center"/>
       </w:pPr>
@@ -2056,13 +2076,14 @@
     </w:p>
     <w:p>
       <w:pPr>
+        <w:keepNext/>
         <w:spacing w:before="120" w:after="60"/>
         <w:jc w:val="center"/>
       </w:pPr>
       <w:r>
         <w:drawing>
           <wp:inline xmlns:a="http://schemas.openxmlformats.org/drawingml/2006/main" xmlns:pic="http://schemas.openxmlformats.org/drawingml/2006/picture">
-            <wp:extent cx="5486400" cy="3474720"/>
+            <wp:extent cx="5120640" cy="3243072"/>
             <wp:docPr id="6" name="Picture 6" title="figure-06-hurdle-score2-pathways" descr="Hurdle Step trajectories showing multiple movement paths among score-2 repetitions."/>
             <wp:cNvGraphicFramePr>
               <a:graphicFrameLocks noChangeAspect="1"/>
@@ -2083,7 +2104,7 @@
                   <pic:spPr>
                     <a:xfrm>
                       <a:off x="0" y="0"/>
-                      <a:ext cx="5486400" cy="3474720"/>
+                      <a:ext cx="5120640" cy="3243072"/>
                     </a:xfrm>
                     <a:prstGeom prst="rect"/>
                   </pic:spPr>
@@ -2132,6 +2153,7 @@
     </w:p>
     <w:p>
       <w:pPr>
+        <w:keepNext/>
         <w:spacing w:before="120" w:after="60"/>
         <w:jc w:val="center"/>
       </w:pPr>
@@ -2203,7 +2225,7 @@
           <w:rFonts w:ascii="Arial" w:hAnsi="Arial"/>
           <w:sz w:val="21"/>
         </w:rPr>
-        <w:t>The project was developed through an iterative collaboration between domain-led human review and generative-AI-assisted engineering. Haoran Zhu's FMS training and repeated scoring work shaped the protocol logic, movement-specific evidence, and acceptance criteria. Human reviewers defined when a repetition was scorable, corrected camera and side metadata, identified information leakage, reviewed every formal item, and determined the claim boundaries.</w:t>
+        <w:t>The project was developed through an iterative collaboration between domain-led human review and generative-AI-assisted engineering. Haoran ZHU's FMS training and repeated scoring work shaped the protocol logic, movement-specific evidence, and acceptance criteria. Human reviewers defined when a repetition was scorable, corrected camera and side metadata, identified information leakage, reviewed every formal item, and determined the claim boundaries.</w:t>
       </w:r>
     </w:p>
     <w:p>
@@ -2220,7 +2242,7 @@
         <w:spacing w:after="80" w:line="283" w:lineRule="auto"/>
         <w:numPr>
           <w:ilvl w:val="0"/>
-          <w:numId w:val="23"/>
+          <w:numId w:val="22"/>
         </w:numPr>
       </w:pPr>
       <w:r>
@@ -2236,7 +2258,7 @@
         <w:spacing w:after="80" w:line="283" w:lineRule="auto"/>
         <w:numPr>
           <w:ilvl w:val="0"/>
-          <w:numId w:val="24"/>
+          <w:numId w:val="23"/>
         </w:numPr>
       </w:pPr>
       <w:r>
@@ -2252,7 +2274,7 @@
         <w:spacing w:after="80" w:line="283" w:lineRule="auto"/>
         <w:numPr>
           <w:ilvl w:val="0"/>
-          <w:numId w:val="25"/>
+          <w:numId w:val="24"/>
         </w:numPr>
       </w:pPr>
       <w:r>
@@ -2269,7 +2291,7 @@
           <w:rFonts w:ascii="Arial" w:hAnsi="Arial"/>
           <w:sz w:val="21"/>
         </w:rPr>
-        <w:t>These examples support a broader design lesson: successful human-AI collaboration is not defined by how much content the model produces. It is defined by whether responsibilities, evidence, uncertainty, and correction paths are explicit. The human authors remain fully responsible for this report, its references, permissions, calculations, and conclusions.</w:t>
+        <w:t>These examples support a broader design lesson: successful human-AI collaboration is not defined by how much content the model produces. It is defined by whether responsibilities, evidence, uncertainty, and correction paths are explicit. The human author remains fully responsible for this report, its references, permissions, calculations, and conclusions.</w:t>
       </w:r>
     </w:p>
     <w:p>
@@ -2351,7 +2373,7 @@
           <w:rFonts w:ascii="Arial" w:hAnsi="Arial"/>
           <w:sz w:val="21"/>
         </w:rPr>
-        <w:t>Second, the two-reviewer audit involved one trained reviewer pair and a short interval. The strong exact agreement should be tested with more reviewers, broader experience levels, longer intervals, and adjudication procedures.</w:t>
+        <w:t>Second, the two-reviewer audit involved one reviewer pair and a short interval. The strong exact agreement should be tested with more reviewers, broader experience levels, longer intervals, and adjudication procedures.</w:t>
       </w:r>
     </w:p>
     <w:p>
@@ -2459,7 +2481,7 @@
         <w:spacing w:after="80" w:line="283" w:lineRule="auto"/>
         <w:numPr>
           <w:ilvl w:val="0"/>
-          <w:numId w:val="26"/>
+          <w:numId w:val="25"/>
         </w:numPr>
       </w:pPr>
       <w:r>
@@ -2475,7 +2497,7 @@
         <w:spacing w:after="80" w:line="283" w:lineRule="auto"/>
         <w:numPr>
           <w:ilvl w:val="0"/>
-          <w:numId w:val="27"/>
+          <w:numId w:val="26"/>
         </w:numPr>
       </w:pPr>
       <w:r>
@@ -2491,7 +2513,7 @@
         <w:spacing w:after="80" w:line="283" w:lineRule="auto"/>
         <w:numPr>
           <w:ilvl w:val="0"/>
-          <w:numId w:val="28"/>
+          <w:numId w:val="27"/>
         </w:numPr>
       </w:pPr>
       <w:r>
@@ -2507,7 +2529,7 @@
         <w:spacing w:after="80" w:line="283" w:lineRule="auto"/>
         <w:numPr>
           <w:ilvl w:val="0"/>
-          <w:numId w:val="29"/>
+          <w:numId w:val="28"/>
         </w:numPr>
       </w:pPr>
       <w:r>
@@ -2523,7 +2545,7 @@
         <w:spacing w:after="80" w:line="283" w:lineRule="auto"/>
         <w:numPr>
           <w:ilvl w:val="0"/>
-          <w:numId w:val="30"/>
+          <w:numId w:val="29"/>
         </w:numPr>
       </w:pPr>
       <w:r>
@@ -2539,7 +2561,7 @@
         <w:spacing w:after="80" w:line="283" w:lineRule="auto"/>
         <w:numPr>
           <w:ilvl w:val="0"/>
-          <w:numId w:val="31"/>
+          <w:numId w:val="30"/>
         </w:numPr>
       </w:pPr>
       <w:r>
@@ -2555,7 +2577,7 @@
         <w:spacing w:after="80" w:line="283" w:lineRule="auto"/>
         <w:numPr>
           <w:ilvl w:val="0"/>
-          <w:numId w:val="32"/>
+          <w:numId w:val="31"/>
         </w:numPr>
       </w:pPr>
       <w:r>
@@ -2571,7 +2593,7 @@
         <w:spacing w:after="80" w:line="283" w:lineRule="auto"/>
         <w:numPr>
           <w:ilvl w:val="0"/>
-          <w:numId w:val="33"/>
+          <w:numId w:val="32"/>
         </w:numPr>
       </w:pPr>
       <w:r>
@@ -2625,24 +2647,7 @@
           <w:rFonts w:ascii="Arial" w:hAnsi="Arial"/>
           <w:sz w:val="21"/>
         </w:rPr>
-        <w:t xml:space="preserve">Code and a privacy-safe demonstration package will be linked after repository rights and secret scanning are complete: </w:t>
-      </w:r>
-      <w:r>
-        <w:rPr>
-          <w:b w:val="0"/>
-          <w:i w:val="0"/>
-          <w:color w:val="7A5A00"/>
-          <w:sz w:val="21"/>
-          <w:highlight w:val="yellow"/>
-        </w:rPr>
-        <w:t>[PUBLIC REPOSITORY URL]</w:t>
-      </w:r>
-      <w:r>
-        <w:rPr>
-          <w:rFonts w:ascii="Arial" w:hAnsi="Arial"/>
-          <w:sz w:val="21"/>
-        </w:rPr>
-        <w:t>. The private Phase I corpus, raw video, pose records, reviewer event logs, comments, and SQLite database are not publicly released because consent and publication rights vary by source. Aggregate analysis outputs and permission-cleared figures accompany this preprint.</w:t>
+        <w:t>Source code and project documentation are available at https://github.com/edwardzhu-HK/AI-FMS. A hosted interactive demonstration is not included with this release. The private Phase I corpus, raw video, pose records, reviewer event logs, comments, and SQLite database are not publicly released because consent and publication rights vary by source. Aggregate analysis outputs and permission-cleared figures accompany this preprint.</w:t>
       </w:r>
     </w:p>
     <w:p>
@@ -2667,56 +2672,14 @@
           <w:i w:val="0"/>
           <w:sz w:val="21"/>
         </w:rPr>
-        <w:t>Haoran Zhu:</w:t>
+        <w:t>Haoran ZHU:</w:t>
       </w:r>
       <w:r>
         <w:rPr>
           <w:rFonts w:ascii="Arial" w:hAnsi="Arial"/>
           <w:sz w:val="21"/>
         </w:rPr>
-        <w:t xml:space="preserve"> Conceptualization; domain protocol; investigation; software testing; human review; validation; visualization review; writing - original draft; writing - review and editing. </w:t>
-      </w:r>
-      <w:r>
-        <w:rPr>
-          <w:rFonts w:ascii="Arial" w:hAnsi="Arial"/>
-          <w:b/>
-          <w:i w:val="0"/>
-          <w:sz w:val="21"/>
-        </w:rPr>
-        <w:t>[CONFIRM OTHER HUMAN AUTHORS]:</w:t>
-      </w:r>
-      <w:r>
-        <w:rPr>
-          <w:rFonts w:ascii="Arial" w:hAnsi="Arial"/>
-          <w:sz w:val="21"/>
-        </w:rPr>
-        <w:t xml:space="preserve"> [ASSIGN CRediT ROLES ONLY AFTER APPROVAL].</w:t>
-      </w:r>
-    </w:p>
-    <w:p>
-      <w:pPr>
-        <w:pStyle w:val="Heading1"/>
-      </w:pPr>
-      <w:r>
-        <w:rPr>
-          <w:rFonts w:ascii="Arial" w:hAnsi="Arial"/>
-        </w:rPr>
-        <w:t>Acknowledgments</w:t>
-      </w:r>
-    </w:p>
-    <w:p>
-      <w:pPr>
-        <w:keepNext w:val="0"/>
-      </w:pPr>
-      <w:r>
-        <w:rPr>
-          <w:b w:val="0"/>
-          <w:i w:val="0"/>
-          <w:color w:val="7A5A00"/>
-          <w:sz w:val="21"/>
-          <w:highlight w:val="yellow"/>
-        </w:rPr>
-        <w:t>[CONFIRM AND WRITE HUMAN ACKNOWLEDGMENTS. Do not list software as an author.]</w:t>
+        <w:t xml:space="preserve"> Conceptualization; domain protocol; investigation; software testing; human review; validation; visualization review; writing - original draft; writing - review and editing.</w:t>
       </w:r>
     </w:p>
     <w:p>
@@ -2739,7 +2702,7 @@
           <w:rFonts w:ascii="Arial" w:hAnsi="Arial"/>
           <w:sz w:val="21"/>
         </w:rPr>
-        <w:t>OpenAI Codex was used under human direction to assist code exploration, implementation, test generation, data reconciliation, statistical scripting, figure preparation, document structuring, language editing, and portions of manuscript drafting. Human authors defined the research questions and FMS protocol, reviewed the source evidence, performed and audited the human scoring, corrected model and metadata errors, verified numerical results and references, determined the limitations and claims, and approved the final text. The human authors take full responsibility for the originality, accuracy, permissions, and integrity of this work.</w:t>
+        <w:t>OpenAI Codex was used under human direction to assist code exploration, implementation, test generation, data reconciliation, statistical scripting, figure preparation, document structuring, language editing, and portions of manuscript drafting. The human author defined the research questions and FMS protocol, reviewed the source evidence, performed and audited the human scoring, corrected model and metadata errors, verified numerical results and references, determined the limitations and claims, and approved the final text. The human author takes full responsibility for the originality, accuracy, permissions, and integrity of this work.</w:t>
       </w:r>
     </w:p>
     <w:p>
@@ -2762,24 +2725,7 @@
           <w:rFonts w:ascii="Arial" w:hAnsi="Arial"/>
           <w:sz w:val="21"/>
         </w:rPr>
-        <w:t xml:space="preserve">The authors declare </w:t>
-      </w:r>
-      <w:r>
-        <w:rPr>
-          <w:b w:val="0"/>
-          <w:i w:val="0"/>
-          <w:color w:val="7A5A00"/>
-          <w:sz w:val="21"/>
-          <w:highlight w:val="yellow"/>
-        </w:rPr>
-        <w:t>[CONFIRM: no competing interests / describe any competing interests]</w:t>
-      </w:r>
-      <w:r>
-        <w:rPr>
-          <w:rFonts w:ascii="Arial" w:hAnsi="Arial"/>
-          <w:sz w:val="21"/>
-        </w:rPr>
-        <w:t>.</w:t>
+        <w:t>The author declares no competing interests.</w:t>
       </w:r>
     </w:p>
     <w:p>
@@ -2799,20 +2745,10 @@
       </w:pPr>
       <w:r>
         <w:rPr>
-          <w:b w:val="0"/>
-          <w:i w:val="0"/>
-          <w:color w:val="7A5A00"/>
-          <w:sz w:val="21"/>
-          <w:highlight w:val="yellow"/>
-        </w:rPr>
-        <w:t>[CONFIRM: no external funding / provide funding statement]</w:t>
-      </w:r>
-      <w:r>
-        <w:rPr>
           <w:rFonts w:ascii="Arial" w:hAnsi="Arial"/>
           <w:sz w:val="21"/>
         </w:rPr>
-        <w:t>.</w:t>
+        <w:t>This work received no external funding.</w:t>
       </w:r>
     </w:p>
     <w:p>
@@ -2831,7 +2767,7 @@
         <w:spacing w:after="80" w:line="283" w:lineRule="auto"/>
         <w:numPr>
           <w:ilvl w:val="0"/>
-          <w:numId w:val="34"/>
+          <w:numId w:val="33"/>
         </w:numPr>
       </w:pPr>
       <w:r>
@@ -2863,7 +2799,7 @@
         <w:spacing w:after="80" w:line="283" w:lineRule="auto"/>
         <w:numPr>
           <w:ilvl w:val="0"/>
-          <w:numId w:val="35"/>
+          <w:numId w:val="34"/>
         </w:numPr>
       </w:pPr>
       <w:r>
@@ -2895,7 +2831,7 @@
         <w:spacing w:after="80" w:line="283" w:lineRule="auto"/>
         <w:numPr>
           <w:ilvl w:val="0"/>
-          <w:numId w:val="36"/>
+          <w:numId w:val="35"/>
         </w:numPr>
       </w:pPr>
       <w:r>
@@ -2927,7 +2863,7 @@
         <w:spacing w:after="80" w:line="283" w:lineRule="auto"/>
         <w:numPr>
           <w:ilvl w:val="0"/>
-          <w:numId w:val="37"/>
+          <w:numId w:val="36"/>
         </w:numPr>
       </w:pPr>
       <w:r>
@@ -2959,7 +2895,7 @@
         <w:spacing w:after="80" w:line="283" w:lineRule="auto"/>
         <w:numPr>
           <w:ilvl w:val="0"/>
-          <w:numId w:val="38"/>
+          <w:numId w:val="37"/>
         </w:numPr>
       </w:pPr>
       <w:r>
@@ -2991,7 +2927,7 @@
         <w:spacing w:after="80" w:line="283" w:lineRule="auto"/>
         <w:numPr>
           <w:ilvl w:val="0"/>
-          <w:numId w:val="39"/>
+          <w:numId w:val="38"/>
         </w:numPr>
       </w:pPr>
       <w:r>
@@ -3023,7 +2959,7 @@
         <w:spacing w:after="80" w:line="283" w:lineRule="auto"/>
         <w:numPr>
           <w:ilvl w:val="0"/>
-          <w:numId w:val="40"/>
+          <w:numId w:val="39"/>
         </w:numPr>
       </w:pPr>
       <w:r>
@@ -3055,7 +2991,7 @@
         <w:spacing w:after="80" w:line="283" w:lineRule="auto"/>
         <w:numPr>
           <w:ilvl w:val="0"/>
-          <w:numId w:val="41"/>
+          <w:numId w:val="40"/>
         </w:numPr>
       </w:pPr>
       <w:r>
@@ -3087,7 +3023,7 @@
         <w:spacing w:after="80" w:line="283" w:lineRule="auto"/>
         <w:numPr>
           <w:ilvl w:val="0"/>
-          <w:numId w:val="42"/>
+          <w:numId w:val="41"/>
         </w:numPr>
       </w:pPr>
       <w:r>
@@ -3444,7 +3380,7 @@
   <w:abstractNum w:abstractNumId="13">
     <w:multiLevelType w:val="singleLevel"/>
     <w:lvl w:ilvl="0">
-      <w:start w:val="4"/>
+      <w:start w:val="1"/>
       <w:numFmt w:val="decimal"/>
       <w:lvlText w:val="%1."/>
       <w:suff w:val="tab"/>
@@ -3462,7 +3398,7 @@
   <w:abstractNum w:abstractNumId="14">
     <w:multiLevelType w:val="singleLevel"/>
     <w:lvl w:ilvl="0">
-      <w:start w:val="1"/>
+      <w:start w:val="2"/>
       <w:numFmt w:val="decimal"/>
       <w:lvlText w:val="%1."/>
       <w:suff w:val="tab"/>
@@ -3480,7 +3416,7 @@
   <w:abstractNum w:abstractNumId="15">
     <w:multiLevelType w:val="singleLevel"/>
     <w:lvl w:ilvl="0">
-      <w:start w:val="2"/>
+      <w:start w:val="3"/>
       <w:numFmt w:val="decimal"/>
       <w:lvlText w:val="%1."/>
       <w:suff w:val="tab"/>
@@ -3498,7 +3434,7 @@
   <w:abstractNum w:abstractNumId="16">
     <w:multiLevelType w:val="singleLevel"/>
     <w:lvl w:ilvl="0">
-      <w:start w:val="3"/>
+      <w:start w:val="4"/>
       <w:numFmt w:val="decimal"/>
       <w:lvlText w:val="%1."/>
       <w:suff w:val="tab"/>
@@ -3516,7 +3452,7 @@
   <w:abstractNum w:abstractNumId="17">
     <w:multiLevelType w:val="singleLevel"/>
     <w:lvl w:ilvl="0">
-      <w:start w:val="4"/>
+      <w:start w:val="5"/>
       <w:numFmt w:val="decimal"/>
       <w:lvlText w:val="%1."/>
       <w:suff w:val="tab"/>
@@ -3534,7 +3470,7 @@
   <w:abstractNum w:abstractNumId="18">
     <w:multiLevelType w:val="singleLevel"/>
     <w:lvl w:ilvl="0">
-      <w:start w:val="5"/>
+      <w:start w:val="6"/>
       <w:numFmt w:val="decimal"/>
       <w:lvlText w:val="%1."/>
       <w:suff w:val="tab"/>
@@ -3552,7 +3488,7 @@
   <w:abstractNum w:abstractNumId="19">
     <w:multiLevelType w:val="singleLevel"/>
     <w:lvl w:ilvl="0">
-      <w:start w:val="6"/>
+      <w:start w:val="7"/>
       <w:numFmt w:val="decimal"/>
       <w:lvlText w:val="%1."/>
       <w:suff w:val="tab"/>
@@ -3570,7 +3506,7 @@
   <w:abstractNum w:abstractNumId="20">
     <w:multiLevelType w:val="singleLevel"/>
     <w:lvl w:ilvl="0">
-      <w:start w:val="7"/>
+      <w:start w:val="8"/>
       <w:numFmt w:val="decimal"/>
       <w:lvlText w:val="%1."/>
       <w:suff w:val="tab"/>
@@ -3588,7 +3524,7 @@
   <w:abstractNum w:abstractNumId="21">
     <w:multiLevelType w:val="singleLevel"/>
     <w:lvl w:ilvl="0">
-      <w:start w:val="8"/>
+      <w:start w:val="1"/>
       <w:numFmt w:val="decimal"/>
       <w:lvlText w:val="%1."/>
       <w:suff w:val="tab"/>
@@ -3606,7 +3542,7 @@
   <w:abstractNum w:abstractNumId="22">
     <w:multiLevelType w:val="singleLevel"/>
     <w:lvl w:ilvl="0">
-      <w:start w:val="1"/>
+      <w:start w:val="2"/>
       <w:numFmt w:val="decimal"/>
       <w:lvlText w:val="%1."/>
       <w:suff w:val="tab"/>
@@ -3624,7 +3560,7 @@
   <w:abstractNum w:abstractNumId="23">
     <w:multiLevelType w:val="singleLevel"/>
     <w:lvl w:ilvl="0">
-      <w:start w:val="2"/>
+      <w:start w:val="3"/>
       <w:numFmt w:val="decimal"/>
       <w:lvlText w:val="%1."/>
       <w:suff w:val="tab"/>
@@ -3642,7 +3578,7 @@
   <w:abstractNum w:abstractNumId="24">
     <w:multiLevelType w:val="singleLevel"/>
     <w:lvl w:ilvl="0">
-      <w:start w:val="3"/>
+      <w:start w:val="1"/>
       <w:numFmt w:val="decimal"/>
       <w:lvlText w:val="%1."/>
       <w:suff w:val="tab"/>
@@ -3660,7 +3596,7 @@
   <w:abstractNum w:abstractNumId="25">
     <w:multiLevelType w:val="singleLevel"/>
     <w:lvl w:ilvl="0">
-      <w:start w:val="1"/>
+      <w:start w:val="2"/>
       <w:numFmt w:val="decimal"/>
       <w:lvlText w:val="%1."/>
       <w:suff w:val="tab"/>
@@ -3678,7 +3614,7 @@
   <w:abstractNum w:abstractNumId="26">
     <w:multiLevelType w:val="singleLevel"/>
     <w:lvl w:ilvl="0">
-      <w:start w:val="2"/>
+      <w:start w:val="3"/>
       <w:numFmt w:val="decimal"/>
       <w:lvlText w:val="%1."/>
       <w:suff w:val="tab"/>
@@ -3696,7 +3632,7 @@
   <w:abstractNum w:abstractNumId="27">
     <w:multiLevelType w:val="singleLevel"/>
     <w:lvl w:ilvl="0">
-      <w:start w:val="3"/>
+      <w:start w:val="4"/>
       <w:numFmt w:val="decimal"/>
       <w:lvlText w:val="%1."/>
       <w:suff w:val="tab"/>
@@ -3714,7 +3650,7 @@
   <w:abstractNum w:abstractNumId="28">
     <w:multiLevelType w:val="singleLevel"/>
     <w:lvl w:ilvl="0">
-      <w:start w:val="4"/>
+      <w:start w:val="5"/>
       <w:numFmt w:val="decimal"/>
       <w:lvlText w:val="%1."/>
       <w:suff w:val="tab"/>
@@ -3732,7 +3668,7 @@
   <w:abstractNum w:abstractNumId="29">
     <w:multiLevelType w:val="singleLevel"/>
     <w:lvl w:ilvl="0">
-      <w:start w:val="5"/>
+      <w:start w:val="6"/>
       <w:numFmt w:val="decimal"/>
       <w:lvlText w:val="%1."/>
       <w:suff w:val="tab"/>
@@ -3750,7 +3686,7 @@
   <w:abstractNum w:abstractNumId="30">
     <w:multiLevelType w:val="singleLevel"/>
     <w:lvl w:ilvl="0">
-      <w:start w:val="6"/>
+      <w:start w:val="7"/>
       <w:numFmt w:val="decimal"/>
       <w:lvlText w:val="%1."/>
       <w:suff w:val="tab"/>
@@ -3768,7 +3704,7 @@
   <w:abstractNum w:abstractNumId="31">
     <w:multiLevelType w:val="singleLevel"/>
     <w:lvl w:ilvl="0">
-      <w:start w:val="7"/>
+      <w:start w:val="8"/>
       <w:numFmt w:val="decimal"/>
       <w:lvlText w:val="%1."/>
       <w:suff w:val="tab"/>
@@ -3786,7 +3722,7 @@
   <w:abstractNum w:abstractNumId="32">
     <w:multiLevelType w:val="singleLevel"/>
     <w:lvl w:ilvl="0">
-      <w:start w:val="8"/>
+      <w:start w:val="1"/>
       <w:numFmt w:val="decimal"/>
       <w:lvlText w:val="%1."/>
       <w:suff w:val="tab"/>
@@ -3804,7 +3740,7 @@
   <w:abstractNum w:abstractNumId="33">
     <w:multiLevelType w:val="singleLevel"/>
     <w:lvl w:ilvl="0">
-      <w:start w:val="1"/>
+      <w:start w:val="2"/>
       <w:numFmt w:val="decimal"/>
       <w:lvlText w:val="%1."/>
       <w:suff w:val="tab"/>
@@ -3822,7 +3758,7 @@
   <w:abstractNum w:abstractNumId="34">
     <w:multiLevelType w:val="singleLevel"/>
     <w:lvl w:ilvl="0">
-      <w:start w:val="2"/>
+      <w:start w:val="3"/>
       <w:numFmt w:val="decimal"/>
       <w:lvlText w:val="%1."/>
       <w:suff w:val="tab"/>
@@ -3840,7 +3776,7 @@
   <w:abstractNum w:abstractNumId="35">
     <w:multiLevelType w:val="singleLevel"/>
     <w:lvl w:ilvl="0">
-      <w:start w:val="3"/>
+      <w:start w:val="4"/>
       <w:numFmt w:val="decimal"/>
       <w:lvlText w:val="%1."/>
       <w:suff w:val="tab"/>
@@ -3858,7 +3794,7 @@
   <w:abstractNum w:abstractNumId="36">
     <w:multiLevelType w:val="singleLevel"/>
     <w:lvl w:ilvl="0">
-      <w:start w:val="4"/>
+      <w:start w:val="5"/>
       <w:numFmt w:val="decimal"/>
       <w:lvlText w:val="%1."/>
       <w:suff w:val="tab"/>
@@ -3876,7 +3812,7 @@
   <w:abstractNum w:abstractNumId="37">
     <w:multiLevelType w:val="singleLevel"/>
     <w:lvl w:ilvl="0">
-      <w:start w:val="5"/>
+      <w:start w:val="6"/>
       <w:numFmt w:val="decimal"/>
       <w:lvlText w:val="%1."/>
       <w:suff w:val="tab"/>
@@ -3894,7 +3830,7 @@
   <w:abstractNum w:abstractNumId="38">
     <w:multiLevelType w:val="singleLevel"/>
     <w:lvl w:ilvl="0">
-      <w:start w:val="6"/>
+      <w:start w:val="7"/>
       <w:numFmt w:val="decimal"/>
       <w:lvlText w:val="%1."/>
       <w:suff w:val="tab"/>
@@ -3912,7 +3848,7 @@
   <w:abstractNum w:abstractNumId="39">
     <w:multiLevelType w:val="singleLevel"/>
     <w:lvl w:ilvl="0">
-      <w:start w:val="7"/>
+      <w:start w:val="8"/>
       <w:numFmt w:val="decimal"/>
       <w:lvlText w:val="%1."/>
       <w:suff w:val="tab"/>
@@ -3930,7 +3866,7 @@
   <w:abstractNum w:abstractNumId="40">
     <w:multiLevelType w:val="singleLevel"/>
     <w:lvl w:ilvl="0">
-      <w:start w:val="8"/>
+      <w:start w:val="9"/>
       <w:numFmt w:val="decimal"/>
       <w:lvlText w:val="%1."/>
       <w:suff w:val="tab"/>
@@ -3944,24 +3880,6 @@
   </w:abstractNum>
   <w:num w:numId="41">
     <w:abstractNumId w:val="40"/>
-  </w:num>
-  <w:abstractNum w:abstractNumId="41">
-    <w:multiLevelType w:val="singleLevel"/>
-    <w:lvl w:ilvl="0">
-      <w:start w:val="9"/>
-      <w:numFmt w:val="decimal"/>
-      <w:lvlText w:val="%1."/>
-      <w:suff w:val="tab"/>
-      <w:pPr>
-        <w:tabs>
-          <w:tab w:val="num" w:pos="540"/>
-        </w:tabs>
-        <w:ind w:left="540" w:hanging="270"/>
-      </w:pPr>
-    </w:lvl>
-  </w:abstractNum>
-  <w:num w:numId="42">
-    <w:abstractNumId w:val="41"/>
   </w:num>
 </w:numbering>
 </file>

</xml_diff>

<commit_message>
Publish Zenodo preprint DOI and verified final manuscript
</commit_message>
<xml_diff>
--- a/output/publication/ai-fms-multichannel-release-2026-08-25/01-zenodo-preprint/AI-FMS_System_Development_Phase_I_Evaluation_Preprint.docx
+++ b/output/publication/ai-fms-multichannel-release-2026-08-25/01-zenodo-preprint/AI-FMS_System_Development_Phase_I_Evaluation_Preprint.docx
@@ -105,7 +105,7 @@
           <w:color w:val="5F7279"/>
           <w:sz w:val="20"/>
         </w:rPr>
-        <w:t>Version 1.0 draft, revised 3 October 2026</w:t>
+        <w:t>Version 1.0, 3 October 2026</w:t>
       </w:r>
     </w:p>
     <w:p>
@@ -119,9 +119,8 @@
           <w:b w:val="0"/>
           <w:color w:val="5F7279"/>
           <w:sz w:val="20"/>
-          <w:highlight w:val="yellow"/>
         </w:rPr>
-        <w:t>DOI: [RESERVE ON ZENODO BEFORE FINAL PDF]</w:t>
+        <w:t>DOI: 10.5281/zenodo.23118144</w:t>
       </w:r>
     </w:p>
     <w:p>

</xml_diff>